<commit_message>
Improve the setup script for local application execution
Update the `start.sh` script to provide clearer instructions, enhance error handling for Node.js and pnpm installations, and improve the dependency installation process.

Replit-Commit-Author: Agent
Replit-Commit-Session-Id: ed7474f6-eba3-49be-ae95-2623f31fe374
Replit-Commit-Checkpoint-Type: full_checkpoint
Replit-Commit-Event-Id: 1c275299-220a-47c8-92f7-b3d14d531d59
Replit-Commit-Screenshot-Url: https://storage.googleapis.com/screenshot-production-us-central1/9eca0e28-34a0-4418-9f5c-60e618813417/ed7474f6-eba3-49be-ae95-2623f31fe374/gLpUmJT
Replit-Helium-Checkpoint-Created: true
</commit_message>
<xml_diff>
--- a/artifacts/api-server/artifacts/api-server/uploads/assets/1/manuscript_6x9.docx
+++ b/artifacts/api-server/artifacts/api-server/uploads/assets/1/manuscript_6x9.docx
@@ -413,14 +413,14 @@
       </w:r>
     </w:p>
     <w:p>
-      <w:bookmarkStart w:id="4621" w:name="chapter_1"/>
+      <w:bookmarkStart w:id="93993" w:name="chapter_1"/>
       <w:pPr>
         <w:pStyle w:val="Heading1"/>
       </w:pPr>
       <w:r>
         <w:t>Session 1: Waking Up in a Burning House</w:t>
       </w:r>
-      <w:bookmarkEnd w:id="4621"/>
+      <w:bookmarkEnd w:id="93993"/>
     </w:p>
     <w:p>
       <w:pPr>
@@ -759,14 +759,14 @@
       </w:r>
     </w:p>
     <w:p>
-      <w:bookmarkStart w:id="3361" w:name="chapter_2"/>
+      <w:bookmarkStart w:id="38953" w:name="chapter_2"/>
       <w:pPr>
         <w:pStyle w:val="Heading1"/>
       </w:pPr>
       <w:r>
         <w:t>Session 2: Diagnosing a Spiritual Crisis</w:t>
       </w:r>
-      <w:bookmarkEnd w:id="3361"/>
+      <w:bookmarkEnd w:id="38953"/>
     </w:p>
     <w:p>
       <w:pPr>
@@ -1105,14 +1105,14 @@
       </w:r>
     </w:p>
     <w:p>
-      <w:bookmarkStart w:id="70661" w:name="chapter_3"/>
+      <w:bookmarkStart w:id="10114" w:name="chapter_3"/>
       <w:pPr>
         <w:pStyle w:val="Heading1"/>
       </w:pPr>
       <w:r>
         <w:t>Session 3: The Church in the Mirror</w:t>
       </w:r>
-      <w:bookmarkEnd w:id="70661"/>
+      <w:bookmarkEnd w:id="10114"/>
     </w:p>
     <w:p>
       <w:pPr>
@@ -1451,14 +1451,14 @@
       </w:r>
     </w:p>
     <w:p>
-      <w:bookmarkStart w:id="9764" w:name="chapter_4"/>
+      <w:bookmarkStart w:id="62632" w:name="chapter_4"/>
       <w:pPr>
         <w:pStyle w:val="Heading1"/>
       </w:pPr>
       <w:r>
         <w:t>Session 4: Repentance as Revolution’s Engine</w:t>
       </w:r>
-      <w:bookmarkEnd w:id="9764"/>
+      <w:bookmarkEnd w:id="62632"/>
     </w:p>
     <w:p>
       <w:pPr>
@@ -1797,14 +1797,14 @@
       </w:r>
     </w:p>
     <w:p>
-      <w:bookmarkStart w:id="76910" w:name="chapter_5"/>
+      <w:bookmarkStart w:id="32192" w:name="chapter_5"/>
       <w:pPr>
         <w:pStyle w:val="Heading1"/>
       </w:pPr>
       <w:r>
         <w:t>Session 5: Courage in a Hostile Age</w:t>
       </w:r>
-      <w:bookmarkEnd w:id="76910"/>
+      <w:bookmarkEnd w:id="32192"/>
     </w:p>
     <w:p>
       <w:pPr>
@@ -2143,14 +2143,14 @@
       </w:r>
     </w:p>
     <w:p>
-      <w:bookmarkStart w:id="21184" w:name="chapter_6"/>
+      <w:bookmarkStart w:id="17459" w:name="chapter_6"/>
       <w:pPr>
         <w:pStyle w:val="Heading1"/>
       </w:pPr>
       <w:r>
         <w:t>Session 6: Public Faith and Cultural Engagement</w:t>
       </w:r>
-      <w:bookmarkEnd w:id="21184"/>
+      <w:bookmarkEnd w:id="17459"/>
     </w:p>
     <w:p>
       <w:pPr>
@@ -2489,14 +2489,14 @@
       </w:r>
     </w:p>
     <w:p>
-      <w:bookmarkStart w:id="16545" w:name="chapter_7"/>
+      <w:bookmarkStart w:id="54708" w:name="chapter_7"/>
       <w:pPr>
         <w:pStyle w:val="Heading1"/>
       </w:pPr>
       <w:r>
         <w:t>Session 7: Prayer, Power, and the Invisible Battle</w:t>
       </w:r>
-      <w:bookmarkEnd w:id="16545"/>
+      <w:bookmarkEnd w:id="54708"/>
     </w:p>
     <w:p>
       <w:pPr>
@@ -2835,14 +2835,14 @@
       </w:r>
     </w:p>
     <w:p>
-      <w:bookmarkStart w:id="43911" w:name="chapter_8"/>
+      <w:bookmarkStart w:id="28171" w:name="chapter_8"/>
       <w:pPr>
         <w:pStyle w:val="Heading1"/>
       </w:pPr>
       <w:r>
         <w:t>Session 8: A Life Reordered by Revolution</w:t>
       </w:r>
-      <w:bookmarkEnd w:id="43911"/>
+      <w:bookmarkEnd w:id="28171"/>
     </w:p>
     <w:p>
       <w:pPr>

</xml_diff>

<commit_message>
Update book manuscript files for upload to bookshelf
Update multiple manuscript files within the artifacts/api-server/uploads/assets directory.

Replit-Commit-Author: Agent
Replit-Commit-Session-Id: ed7474f6-eba3-49be-ae95-2623f31fe374
Replit-Commit-Checkpoint-Type: full_checkpoint
Replit-Commit-Event-Id: 07c305cd-0eca-4756-a682-cc52f0ed8f3e
Replit-Commit-Screenshot-Url: https://storage.googleapis.com/screenshot-production-us-central1/9eca0e28-34a0-4418-9f5c-60e618813417/ed7474f6-eba3-49be-ae95-2623f31fe374/gLpUmJT
Replit-Helium-Checkpoint-Created: true
</commit_message>
<xml_diff>
--- a/artifacts/api-server/artifacts/api-server/uploads/assets/1/manuscript_6x9.docx
+++ b/artifacts/api-server/artifacts/api-server/uploads/assets/1/manuscript_6x9.docx
@@ -413,14 +413,14 @@
       </w:r>
     </w:p>
     <w:p>
-      <w:bookmarkStart w:id="93993" w:name="chapter_1"/>
+      <w:bookmarkStart w:id="90777" w:name="chapter_1"/>
       <w:pPr>
         <w:pStyle w:val="Heading1"/>
       </w:pPr>
       <w:r>
         <w:t>Session 1: Waking Up in a Burning House</w:t>
       </w:r>
-      <w:bookmarkEnd w:id="93993"/>
+      <w:bookmarkEnd w:id="90777"/>
     </w:p>
     <w:p>
       <w:pPr>
@@ -759,14 +759,14 @@
       </w:r>
     </w:p>
     <w:p>
-      <w:bookmarkStart w:id="38953" w:name="chapter_2"/>
+      <w:bookmarkStart w:id="49897" w:name="chapter_2"/>
       <w:pPr>
         <w:pStyle w:val="Heading1"/>
       </w:pPr>
       <w:r>
         <w:t>Session 2: Diagnosing a Spiritual Crisis</w:t>
       </w:r>
-      <w:bookmarkEnd w:id="38953"/>
+      <w:bookmarkEnd w:id="49897"/>
     </w:p>
     <w:p>
       <w:pPr>
@@ -1105,14 +1105,14 @@
       </w:r>
     </w:p>
     <w:p>
-      <w:bookmarkStart w:id="10114" w:name="chapter_3"/>
+      <w:bookmarkStart w:id="82840" w:name="chapter_3"/>
       <w:pPr>
         <w:pStyle w:val="Heading1"/>
       </w:pPr>
       <w:r>
         <w:t>Session 3: The Church in the Mirror</w:t>
       </w:r>
-      <w:bookmarkEnd w:id="10114"/>
+      <w:bookmarkEnd w:id="82840"/>
     </w:p>
     <w:p>
       <w:pPr>
@@ -1451,14 +1451,14 @@
       </w:r>
     </w:p>
     <w:p>
-      <w:bookmarkStart w:id="62632" w:name="chapter_4"/>
+      <w:bookmarkStart w:id="33573" w:name="chapter_4"/>
       <w:pPr>
         <w:pStyle w:val="Heading1"/>
       </w:pPr>
       <w:r>
         <w:t>Session 4: Repentance as Revolution’s Engine</w:t>
       </w:r>
-      <w:bookmarkEnd w:id="62632"/>
+      <w:bookmarkEnd w:id="33573"/>
     </w:p>
     <w:p>
       <w:pPr>
@@ -1797,14 +1797,14 @@
       </w:r>
     </w:p>
     <w:p>
-      <w:bookmarkStart w:id="32192" w:name="chapter_5"/>
+      <w:bookmarkStart w:id="19467" w:name="chapter_5"/>
       <w:pPr>
         <w:pStyle w:val="Heading1"/>
       </w:pPr>
       <w:r>
         <w:t>Session 5: Courage in a Hostile Age</w:t>
       </w:r>
-      <w:bookmarkEnd w:id="32192"/>
+      <w:bookmarkEnd w:id="19467"/>
     </w:p>
     <w:p>
       <w:pPr>
@@ -2143,14 +2143,14 @@
       </w:r>
     </w:p>
     <w:p>
-      <w:bookmarkStart w:id="17459" w:name="chapter_6"/>
+      <w:bookmarkStart w:id="23177" w:name="chapter_6"/>
       <w:pPr>
         <w:pStyle w:val="Heading1"/>
       </w:pPr>
       <w:r>
         <w:t>Session 6: Public Faith and Cultural Engagement</w:t>
       </w:r>
-      <w:bookmarkEnd w:id="17459"/>
+      <w:bookmarkEnd w:id="23177"/>
     </w:p>
     <w:p>
       <w:pPr>
@@ -2489,14 +2489,14 @@
       </w:r>
     </w:p>
     <w:p>
-      <w:bookmarkStart w:id="54708" w:name="chapter_7"/>
+      <w:bookmarkStart w:id="66336" w:name="chapter_7"/>
       <w:pPr>
         <w:pStyle w:val="Heading1"/>
       </w:pPr>
       <w:r>
         <w:t>Session 7: Prayer, Power, and the Invisible Battle</w:t>
       </w:r>
-      <w:bookmarkEnd w:id="54708"/>
+      <w:bookmarkEnd w:id="66336"/>
     </w:p>
     <w:p>
       <w:pPr>
@@ -2835,14 +2835,14 @@
       </w:r>
     </w:p>
     <w:p>
-      <w:bookmarkStart w:id="28171" w:name="chapter_8"/>
+      <w:bookmarkStart w:id="94516" w:name="chapter_8"/>
       <w:pPr>
         <w:pStyle w:val="Heading1"/>
       </w:pPr>
       <w:r>
         <w:t>Session 8: A Life Reordered by Revolution</w:t>
       </w:r>
-      <w:bookmarkEnd w:id="28171"/>
+      <w:bookmarkEnd w:id="94516"/>
     </w:p>
     <w:p>
       <w:pPr>

</xml_diff>

<commit_message>
Update manuscript files for book uploads
Update manuscript files at paths artifacts/api-server/artifacts/api-server/uploads/assets/1/manuscript_6x9.docx and artifacts/api-server/artifacts/api-server/uploads/assets/14/manuscript_6x9.docx.

Replit-Commit-Author: Agent
Replit-Commit-Session-Id: ed7474f6-eba3-49be-ae95-2623f31fe374
Replit-Commit-Checkpoint-Type: full_checkpoint
Replit-Commit-Event-Id: 9524163f-4599-4220-ae6c-19fa0d5ee3d2
Replit-Commit-Screenshot-Url: https://storage.googleapis.com/screenshot-production-us-central1/9eca0e28-34a0-4418-9f5c-60e618813417/ed7474f6-eba3-49be-ae95-2623f31fe374/gLpUmJT
Replit-Helium-Checkpoint-Created: true
</commit_message>
<xml_diff>
--- a/artifacts/api-server/artifacts/api-server/uploads/assets/1/manuscript_6x9.docx
+++ b/artifacts/api-server/artifacts/api-server/uploads/assets/1/manuscript_6x9.docx
@@ -413,14 +413,14 @@
       </w:r>
     </w:p>
     <w:p>
-      <w:bookmarkStart w:id="90777" w:name="chapter_1"/>
+      <w:bookmarkStart w:id="32236" w:name="chapter_1"/>
       <w:pPr>
         <w:pStyle w:val="Heading1"/>
       </w:pPr>
       <w:r>
         <w:t>Session 1: Waking Up in a Burning House</w:t>
       </w:r>
-      <w:bookmarkEnd w:id="90777"/>
+      <w:bookmarkEnd w:id="32236"/>
     </w:p>
     <w:p>
       <w:pPr>
@@ -759,14 +759,14 @@
       </w:r>
     </w:p>
     <w:p>
-      <w:bookmarkStart w:id="49897" w:name="chapter_2"/>
+      <w:bookmarkStart w:id="74553" w:name="chapter_2"/>
       <w:pPr>
         <w:pStyle w:val="Heading1"/>
       </w:pPr>
       <w:r>
         <w:t>Session 2: Diagnosing a Spiritual Crisis</w:t>
       </w:r>
-      <w:bookmarkEnd w:id="49897"/>
+      <w:bookmarkEnd w:id="74553"/>
     </w:p>
     <w:p>
       <w:pPr>
@@ -1105,14 +1105,14 @@
       </w:r>
     </w:p>
     <w:p>
-      <w:bookmarkStart w:id="82840" w:name="chapter_3"/>
+      <w:bookmarkStart w:id="17573" w:name="chapter_3"/>
       <w:pPr>
         <w:pStyle w:val="Heading1"/>
       </w:pPr>
       <w:r>
         <w:t>Session 3: The Church in the Mirror</w:t>
       </w:r>
-      <w:bookmarkEnd w:id="82840"/>
+      <w:bookmarkEnd w:id="17573"/>
     </w:p>
     <w:p>
       <w:pPr>
@@ -1451,14 +1451,14 @@
       </w:r>
     </w:p>
     <w:p>
-      <w:bookmarkStart w:id="33573" w:name="chapter_4"/>
+      <w:bookmarkStart w:id="25757" w:name="chapter_4"/>
       <w:pPr>
         <w:pStyle w:val="Heading1"/>
       </w:pPr>
       <w:r>
         <w:t>Session 4: Repentance as Revolution’s Engine</w:t>
       </w:r>
-      <w:bookmarkEnd w:id="33573"/>
+      <w:bookmarkEnd w:id="25757"/>
     </w:p>
     <w:p>
       <w:pPr>
@@ -1797,14 +1797,14 @@
       </w:r>
     </w:p>
     <w:p>
-      <w:bookmarkStart w:id="19467" w:name="chapter_5"/>
+      <w:bookmarkStart w:id="57862" w:name="chapter_5"/>
       <w:pPr>
         <w:pStyle w:val="Heading1"/>
       </w:pPr>
       <w:r>
         <w:t>Session 5: Courage in a Hostile Age</w:t>
       </w:r>
-      <w:bookmarkEnd w:id="19467"/>
+      <w:bookmarkEnd w:id="57862"/>
     </w:p>
     <w:p>
       <w:pPr>
@@ -2143,14 +2143,14 @@
       </w:r>
     </w:p>
     <w:p>
-      <w:bookmarkStart w:id="23177" w:name="chapter_6"/>
+      <w:bookmarkStart w:id="24622" w:name="chapter_6"/>
       <w:pPr>
         <w:pStyle w:val="Heading1"/>
       </w:pPr>
       <w:r>
         <w:t>Session 6: Public Faith and Cultural Engagement</w:t>
       </w:r>
-      <w:bookmarkEnd w:id="23177"/>
+      <w:bookmarkEnd w:id="24622"/>
     </w:p>
     <w:p>
       <w:pPr>
@@ -2489,14 +2489,14 @@
       </w:r>
     </w:p>
     <w:p>
-      <w:bookmarkStart w:id="66336" w:name="chapter_7"/>
+      <w:bookmarkStart w:id="68264" w:name="chapter_7"/>
       <w:pPr>
         <w:pStyle w:val="Heading1"/>
       </w:pPr>
       <w:r>
         <w:t>Session 7: Prayer, Power, and the Invisible Battle</w:t>
       </w:r>
-      <w:bookmarkEnd w:id="66336"/>
+      <w:bookmarkEnd w:id="68264"/>
     </w:p>
     <w:p>
       <w:pPr>
@@ -2835,14 +2835,14 @@
       </w:r>
     </w:p>
     <w:p>
-      <w:bookmarkStart w:id="94516" w:name="chapter_8"/>
+      <w:bookmarkStart w:id="77835" w:name="chapter_8"/>
       <w:pPr>
         <w:pStyle w:val="Heading1"/>
       </w:pPr>
       <w:r>
         <w:t>Session 8: A Life Reordered by Revolution</w:t>
       </w:r>
-      <w:bookmarkEnd w:id="94516"/>
+      <w:bookmarkEnd w:id="77835"/>
     </w:p>
     <w:p>
       <w:pPr>

</xml_diff>

<commit_message>
Improve bookshelf scanner's ability to navigate through multiple pages
Update the KDP bookshelf scanner to use more robust Playwright locators for detecting and clicking the "Next" page button, bypassing unreliable DOM-based hasNextPage checks.

Replit-Commit-Author: Agent
Replit-Commit-Session-Id: ed7474f6-eba3-49be-ae95-2623f31fe374
Replit-Commit-Checkpoint-Type: full_checkpoint
Replit-Commit-Event-Id: 4334979a-9835-4542-85c5-bb3f6fb45787
Replit-Commit-Screenshot-Url: https://storage.googleapis.com/screenshot-production-us-central1/9eca0e28-34a0-4418-9f5c-60e618813417/ed7474f6-eba3-49be-ae95-2623f31fe374/gLpUmJT
Replit-Helium-Checkpoint-Created: true
</commit_message>
<xml_diff>
--- a/artifacts/api-server/artifacts/api-server/uploads/assets/1/manuscript_6x9.docx
+++ b/artifacts/api-server/artifacts/api-server/uploads/assets/1/manuscript_6x9.docx
@@ -413,14 +413,14 @@
       </w:r>
     </w:p>
     <w:p>
-      <w:bookmarkStart w:id="32236" w:name="chapter_1"/>
+      <w:bookmarkStart w:id="70312" w:name="chapter_1"/>
       <w:pPr>
         <w:pStyle w:val="Heading1"/>
       </w:pPr>
       <w:r>
         <w:t>Session 1: Waking Up in a Burning House</w:t>
       </w:r>
-      <w:bookmarkEnd w:id="32236"/>
+      <w:bookmarkEnd w:id="70312"/>
     </w:p>
     <w:p>
       <w:pPr>
@@ -759,14 +759,14 @@
       </w:r>
     </w:p>
     <w:p>
-      <w:bookmarkStart w:id="74553" w:name="chapter_2"/>
+      <w:bookmarkStart w:id="57706" w:name="chapter_2"/>
       <w:pPr>
         <w:pStyle w:val="Heading1"/>
       </w:pPr>
       <w:r>
         <w:t>Session 2: Diagnosing a Spiritual Crisis</w:t>
       </w:r>
-      <w:bookmarkEnd w:id="74553"/>
+      <w:bookmarkEnd w:id="57706"/>
     </w:p>
     <w:p>
       <w:pPr>
@@ -1105,14 +1105,14 @@
       </w:r>
     </w:p>
     <w:p>
-      <w:bookmarkStart w:id="17573" w:name="chapter_3"/>
+      <w:bookmarkStart w:id="3579" w:name="chapter_3"/>
       <w:pPr>
         <w:pStyle w:val="Heading1"/>
       </w:pPr>
       <w:r>
         <w:t>Session 3: The Church in the Mirror</w:t>
       </w:r>
-      <w:bookmarkEnd w:id="17573"/>
+      <w:bookmarkEnd w:id="3579"/>
     </w:p>
     <w:p>
       <w:pPr>
@@ -1451,14 +1451,14 @@
       </w:r>
     </w:p>
     <w:p>
-      <w:bookmarkStart w:id="25757" w:name="chapter_4"/>
+      <w:bookmarkStart w:id="94657" w:name="chapter_4"/>
       <w:pPr>
         <w:pStyle w:val="Heading1"/>
       </w:pPr>
       <w:r>
         <w:t>Session 4: Repentance as Revolution’s Engine</w:t>
       </w:r>
-      <w:bookmarkEnd w:id="25757"/>
+      <w:bookmarkEnd w:id="94657"/>
     </w:p>
     <w:p>
       <w:pPr>
@@ -1797,14 +1797,14 @@
       </w:r>
     </w:p>
     <w:p>
-      <w:bookmarkStart w:id="57862" w:name="chapter_5"/>
+      <w:bookmarkStart w:id="9644" w:name="chapter_5"/>
       <w:pPr>
         <w:pStyle w:val="Heading1"/>
       </w:pPr>
       <w:r>
         <w:t>Session 5: Courage in a Hostile Age</w:t>
       </w:r>
-      <w:bookmarkEnd w:id="57862"/>
+      <w:bookmarkEnd w:id="9644"/>
     </w:p>
     <w:p>
       <w:pPr>
@@ -2143,14 +2143,14 @@
       </w:r>
     </w:p>
     <w:p>
-      <w:bookmarkStart w:id="24622" w:name="chapter_6"/>
+      <w:bookmarkStart w:id="16676" w:name="chapter_6"/>
       <w:pPr>
         <w:pStyle w:val="Heading1"/>
       </w:pPr>
       <w:r>
         <w:t>Session 6: Public Faith and Cultural Engagement</w:t>
       </w:r>
-      <w:bookmarkEnd w:id="24622"/>
+      <w:bookmarkEnd w:id="16676"/>
     </w:p>
     <w:p>
       <w:pPr>
@@ -2489,14 +2489,14 @@
       </w:r>
     </w:p>
     <w:p>
-      <w:bookmarkStart w:id="68264" w:name="chapter_7"/>
+      <w:bookmarkStart w:id="16239" w:name="chapter_7"/>
       <w:pPr>
         <w:pStyle w:val="Heading1"/>
       </w:pPr>
       <w:r>
         <w:t>Session 7: Prayer, Power, and the Invisible Battle</w:t>
       </w:r>
-      <w:bookmarkEnd w:id="68264"/>
+      <w:bookmarkEnd w:id="16239"/>
     </w:p>
     <w:p>
       <w:pPr>
@@ -2835,14 +2835,14 @@
       </w:r>
     </w:p>
     <w:p>
-      <w:bookmarkStart w:id="77835" w:name="chapter_8"/>
+      <w:bookmarkStart w:id="80699" w:name="chapter_8"/>
       <w:pPr>
         <w:pStyle w:val="Heading1"/>
       </w:pPr>
       <w:r>
         <w:t>Session 8: A Life Reordered by Revolution</w:t>
       </w:r>
-      <w:bookmarkEnd w:id="77835"/>
+      <w:bookmarkEnd w:id="80699"/>
     </w:p>
     <w:p>
       <w:pPr>

</xml_diff>

<commit_message>
Improve book upload scanner by using AI for page navigation
Update the KDP bookshelf scanner to utilize AI vision for locating and clicking the "Next page" button, improving reliability and abstracting away DOM-specific selectors.

Replit-Commit-Author: Agent
Replit-Commit-Session-Id: ed7474f6-eba3-49be-ae95-2623f31fe374
Replit-Commit-Checkpoint-Type: full_checkpoint
Replit-Commit-Event-Id: 07644079-7ba3-4bff-9e1c-ccdaf7db17f4
Replit-Commit-Screenshot-Url: https://storage.googleapis.com/screenshot-production-us-central1/9eca0e28-34a0-4418-9f5c-60e618813417/ed7474f6-eba3-49be-ae95-2623f31fe374/gLpUmJT
Replit-Helium-Checkpoint-Created: true
</commit_message>
<xml_diff>
--- a/artifacts/api-server/artifacts/api-server/uploads/assets/1/manuscript_6x9.docx
+++ b/artifacts/api-server/artifacts/api-server/uploads/assets/1/manuscript_6x9.docx
@@ -413,14 +413,14 @@
       </w:r>
     </w:p>
     <w:p>
-      <w:bookmarkStart w:id="70312" w:name="chapter_1"/>
+      <w:bookmarkStart w:id="65266" w:name="chapter_1"/>
       <w:pPr>
         <w:pStyle w:val="Heading1"/>
       </w:pPr>
       <w:r>
         <w:t>Session 1: Waking Up in a Burning House</w:t>
       </w:r>
-      <w:bookmarkEnd w:id="70312"/>
+      <w:bookmarkEnd w:id="65266"/>
     </w:p>
     <w:p>
       <w:pPr>
@@ -759,14 +759,14 @@
       </w:r>
     </w:p>
     <w:p>
-      <w:bookmarkStart w:id="57706" w:name="chapter_2"/>
+      <w:bookmarkStart w:id="87961" w:name="chapter_2"/>
       <w:pPr>
         <w:pStyle w:val="Heading1"/>
       </w:pPr>
       <w:r>
         <w:t>Session 2: Diagnosing a Spiritual Crisis</w:t>
       </w:r>
-      <w:bookmarkEnd w:id="57706"/>
+      <w:bookmarkEnd w:id="87961"/>
     </w:p>
     <w:p>
       <w:pPr>
@@ -1105,14 +1105,14 @@
       </w:r>
     </w:p>
     <w:p>
-      <w:bookmarkStart w:id="3579" w:name="chapter_3"/>
+      <w:bookmarkStart w:id="14585" w:name="chapter_3"/>
       <w:pPr>
         <w:pStyle w:val="Heading1"/>
       </w:pPr>
       <w:r>
         <w:t>Session 3: The Church in the Mirror</w:t>
       </w:r>
-      <w:bookmarkEnd w:id="3579"/>
+      <w:bookmarkEnd w:id="14585"/>
     </w:p>
     <w:p>
       <w:pPr>
@@ -1451,14 +1451,14 @@
       </w:r>
     </w:p>
     <w:p>
-      <w:bookmarkStart w:id="94657" w:name="chapter_4"/>
+      <w:bookmarkStart w:id="86009" w:name="chapter_4"/>
       <w:pPr>
         <w:pStyle w:val="Heading1"/>
       </w:pPr>
       <w:r>
         <w:t>Session 4: Repentance as Revolution’s Engine</w:t>
       </w:r>
-      <w:bookmarkEnd w:id="94657"/>
+      <w:bookmarkEnd w:id="86009"/>
     </w:p>
     <w:p>
       <w:pPr>
@@ -1797,14 +1797,14 @@
       </w:r>
     </w:p>
     <w:p>
-      <w:bookmarkStart w:id="9644" w:name="chapter_5"/>
+      <w:bookmarkStart w:id="2737" w:name="chapter_5"/>
       <w:pPr>
         <w:pStyle w:val="Heading1"/>
       </w:pPr>
       <w:r>
         <w:t>Session 5: Courage in a Hostile Age</w:t>
       </w:r>
-      <w:bookmarkEnd w:id="9644"/>
+      <w:bookmarkEnd w:id="2737"/>
     </w:p>
     <w:p>
       <w:pPr>
@@ -2143,14 +2143,14 @@
       </w:r>
     </w:p>
     <w:p>
-      <w:bookmarkStart w:id="16676" w:name="chapter_6"/>
+      <w:bookmarkStart w:id="74875" w:name="chapter_6"/>
       <w:pPr>
         <w:pStyle w:val="Heading1"/>
       </w:pPr>
       <w:r>
         <w:t>Session 6: Public Faith and Cultural Engagement</w:t>
       </w:r>
-      <w:bookmarkEnd w:id="16676"/>
+      <w:bookmarkEnd w:id="74875"/>
     </w:p>
     <w:p>
       <w:pPr>
@@ -2489,14 +2489,14 @@
       </w:r>
     </w:p>
     <w:p>
-      <w:bookmarkStart w:id="16239" w:name="chapter_7"/>
+      <w:bookmarkStart w:id="13489" w:name="chapter_7"/>
       <w:pPr>
         <w:pStyle w:val="Heading1"/>
       </w:pPr>
       <w:r>
         <w:t>Session 7: Prayer, Power, and the Invisible Battle</w:t>
       </w:r>
-      <w:bookmarkEnd w:id="16239"/>
+      <w:bookmarkEnd w:id="13489"/>
     </w:p>
     <w:p>
       <w:pPr>
@@ -2835,14 +2835,14 @@
       </w:r>
     </w:p>
     <w:p>
-      <w:bookmarkStart w:id="80699" w:name="chapter_8"/>
+      <w:bookmarkStart w:id="40989" w:name="chapter_8"/>
       <w:pPr>
         <w:pStyle w:val="Heading1"/>
       </w:pPr>
       <w:r>
         <w:t>Session 8: A Life Reordered by Revolution</w:t>
       </w:r>
-      <w:bookmarkEnd w:id="80699"/>
+      <w:bookmarkEnd w:id="40989"/>
     </w:p>
     <w:p>
       <w:pPr>

</xml_diff>